<commit_message>
remove last blank page
</commit_message>
<xml_diff>
--- a/paper/Neurotron/Neurotron.docx
+++ b/paper/Neurotron/Neurotron.docx
@@ -1,6 +1,6 @@
 
 <file path=word/document.xml><?xml version="1.0" encoding="utf-8"?>
-<w:document xmlns:wpc="http://schemas.microsoft.com/office/word/2010/wordprocessingCanvas" xmlns:cx="http://schemas.microsoft.com/office/drawing/2014/chartex" xmlns:cx1="http://schemas.microsoft.com/office/drawing/2015/9/8/chartex" xmlns:cx2="http://schemas.microsoft.com/office/drawing/2015/10/21/chartex" xmlns:cx3="http://schemas.microsoft.com/office/drawing/2016/5/9/chartex" xmlns:cx4="http://schemas.microsoft.com/office/drawing/2016/5/10/chartex" xmlns:cx5="http://schemas.microsoft.com/office/drawing/2016/5/11/chartex" xmlns:cx6="http://schemas.microsoft.com/office/drawing/2016/5/12/chartex" xmlns:cx7="http://schemas.microsoft.com/office/drawing/2016/5/13/chartex" xmlns:cx8="http://schemas.microsoft.com/office/drawing/2016/5/14/chartex" xmlns:mc="http://schemas.openxmlformats.org/markup-compatibility/2006" xmlns:aink="http://schemas.microsoft.com/office/drawing/2016/ink" xmlns:am3d="http://schemas.microsoft.com/office/drawing/2017/model3d" xmlns:o="urn:schemas-microsoft-com:office:office" xmlns:oel="http://schemas.microsoft.com/office/2019/extlst" xmlns:r="http://schemas.openxmlformats.org/officeDocument/2006/relationships" xmlns:m="http://schemas.openxmlformats.org/officeDocument/2006/math" xmlns:v="urn:schemas-microsoft-com:vml" xmlns:wp14="http://schemas.microsoft.com/office/word/2010/wordprocessingDrawing" xmlns:wp="http://schemas.openxmlformats.org/drawingml/2006/wordprocessingDrawing" xmlns:w10="urn:schemas-microsoft-com:office:word" xmlns:w="http://schemas.openxmlformats.org/wordprocessingml/2006/main" xmlns:w14="http://schemas.microsoft.com/office/word/2010/wordml" xmlns:w15="http://schemas.microsoft.com/office/word/2012/wordml" xmlns:w16cex="http://schemas.microsoft.com/office/word/2018/wordml/cex" xmlns:w16cid="http://schemas.microsoft.com/office/word/2016/wordml/cid" xmlns:w16="http://schemas.microsoft.com/office/word/2018/wordml" xmlns:w16sdtdh="http://schemas.microsoft.com/office/word/2020/wordml/sdtdatahash" xmlns:w16se="http://schemas.microsoft.com/office/word/2015/wordml/symex" xmlns:wpg="http://schemas.microsoft.com/office/word/2010/wordprocessingGroup" xmlns:wpi="http://schemas.microsoft.com/office/word/2010/wordprocessingInk" xmlns:wne="http://schemas.microsoft.com/office/word/2006/wordml" xmlns:wps="http://schemas.microsoft.com/office/word/2010/wordprocessingShape" mc:Ignorable="w14 w15 w16se w16cid w16 w16cex w16sdtdh wp14">
+<w:document xmlns:wpc="http://schemas.microsoft.com/office/word/2010/wordprocessingCanvas" xmlns:cx="http://schemas.microsoft.com/office/drawing/2014/chartex" xmlns:cx1="http://schemas.microsoft.com/office/drawing/2015/9/8/chartex" xmlns:cx2="http://schemas.microsoft.com/office/drawing/2015/10/21/chartex" xmlns:cx3="http://schemas.microsoft.com/office/drawing/2016/5/9/chartex" xmlns:cx4="http://schemas.microsoft.com/office/drawing/2016/5/10/chartex" xmlns:cx5="http://schemas.microsoft.com/office/drawing/2016/5/11/chartex" xmlns:cx6="http://schemas.microsoft.com/office/drawing/2016/5/12/chartex" xmlns:cx7="http://schemas.microsoft.com/office/drawing/2016/5/13/chartex" xmlns:cx8="http://schemas.microsoft.com/office/drawing/2016/5/14/chartex" xmlns:mc="http://schemas.openxmlformats.org/markup-compatibility/2006" xmlns:aink="http://schemas.microsoft.com/office/drawing/2016/ink" xmlns:am3d="http://schemas.microsoft.com/office/drawing/2017/model3d" xmlns:o="urn:schemas-microsoft-com:office:office" xmlns:oel="http://schemas.microsoft.com/office/2019/extlst" xmlns:r="http://schemas.openxmlformats.org/officeDocument/2006/relationships" xmlns:m="http://schemas.openxmlformats.org/officeDocument/2006/math" xmlns:v="urn:schemas-microsoft-com:vml" xmlns:wp14="http://schemas.microsoft.com/office/word/2010/wordprocessingDrawing" xmlns:wp="http://schemas.openxmlformats.org/drawingml/2006/wordprocessingDrawing" xmlns:w10="urn:schemas-microsoft-com:office:word" xmlns:w="http://schemas.openxmlformats.org/wordprocessingml/2006/main" xmlns:w14="http://schemas.microsoft.com/office/word/2010/wordml" xmlns:w15="http://schemas.microsoft.com/office/word/2012/wordml" xmlns:w16cex="http://schemas.microsoft.com/office/word/2018/wordml/cex" xmlns:w16cid="http://schemas.microsoft.com/office/word/2016/wordml/cid" xmlns:w16="http://schemas.microsoft.com/office/word/2018/wordml" xmlns:w16du="http://schemas.microsoft.com/office/word/2023/wordml/word16du" xmlns:w16sdtdh="http://schemas.microsoft.com/office/word/2020/wordml/sdtdatahash" xmlns:w16sdtfl="http://schemas.microsoft.com/office/word/2024/wordml/sdtformatlock" xmlns:w16se="http://schemas.microsoft.com/office/word/2015/wordml/symex" xmlns:wpg="http://schemas.microsoft.com/office/word/2010/wordprocessingGroup" xmlns:wpi="http://schemas.microsoft.com/office/word/2010/wordprocessingInk" xmlns:wne="http://schemas.microsoft.com/office/word/2006/wordml" xmlns:wps="http://schemas.microsoft.com/office/word/2010/wordprocessingShape" mc:Ignorable="w14 w15 w16se w16cid w16 w16cex w16sdtdh w16sdtfl w16du wp14">
   <w:body>
     <w:p>
       <w:pPr>
@@ -13425,6 +13425,7 @@
       </w:pPr>
       <w:r>
         <w:rPr>
+          <w:noProof/>
           <w:lang w:val="en-US"/>
         </w:rPr>
         <w:drawing>
@@ -14741,6 +14742,7 @@
       </w:pPr>
       <w:r>
         <w:rPr>
+          <w:noProof/>
           <w:lang w:val="de-AT"/>
         </w:rPr>
         <w:drawing>
@@ -24126,27 +24128,7 @@
           <w:szCs w:val="16"/>
           <w:lang w:val="en-US"/>
         </w:rPr>
-        <w:t xml:space="preserve">[14] </w:t>
-      </w:r>
-      <w:proofErr w:type="spellStart"/>
-      <w:r>
-        <w:rPr>
-          <w:rFonts w:cs="Times New Roman"/>
-          <w:sz w:val="16"/>
-          <w:szCs w:val="16"/>
-          <w:lang w:val="en-US"/>
-        </w:rPr>
-        <w:t>Brette</w:t>
-      </w:r>
-      <w:proofErr w:type="spellEnd"/>
-      <w:r>
-        <w:rPr>
-          <w:rFonts w:cs="Times New Roman"/>
-          <w:sz w:val="16"/>
-          <w:szCs w:val="16"/>
-          <w:lang w:val="en-US"/>
-        </w:rPr>
-        <w:t xml:space="preserve"> R., Gerstner W.: Adaptive Exponential Integrate-a</w:t>
+        <w:t>[14] Brette R., Gerstner W.: Adaptive Exponential Integrate-a</w:t>
       </w:r>
       <w:r>
         <w:rPr>
@@ -24529,23 +24511,6 @@
         </w:rPr>
         <w:t>.</w:t>
       </w:r>
-    </w:p>
-    <w:p>
-      <w:pPr>
-        <w:rPr>
-          <w:sz w:val="16"/>
-          <w:szCs w:val="16"/>
-          <w:lang w:val="en-US"/>
-        </w:rPr>
-      </w:pPr>
-    </w:p>
-    <w:p>
-      <w:pPr>
-        <w:rPr>
-          <w:rStyle w:val="Seitenzahl"/>
-          <w:lang w:val="en-US"/>
-        </w:rPr>
-      </w:pPr>
     </w:p>
     <w:p>
       <w:pPr>
@@ -24566,7 +24531,7 @@
 </file>
 
 <file path=word/endnotes.xml><?xml version="1.0" encoding="utf-8"?>
-<w:endnotes xmlns:wpc="http://schemas.microsoft.com/office/word/2010/wordprocessingCanvas" xmlns:cx="http://schemas.microsoft.com/office/drawing/2014/chartex" xmlns:cx1="http://schemas.microsoft.com/office/drawing/2015/9/8/chartex" xmlns:cx2="http://schemas.microsoft.com/office/drawing/2015/10/21/chartex" xmlns:cx3="http://schemas.microsoft.com/office/drawing/2016/5/9/chartex" xmlns:cx4="http://schemas.microsoft.com/office/drawing/2016/5/10/chartex" xmlns:cx5="http://schemas.microsoft.com/office/drawing/2016/5/11/chartex" xmlns:cx6="http://schemas.microsoft.com/office/drawing/2016/5/12/chartex" xmlns:cx7="http://schemas.microsoft.com/office/drawing/2016/5/13/chartex" xmlns:cx8="http://schemas.microsoft.com/office/drawing/2016/5/14/chartex" xmlns:mc="http://schemas.openxmlformats.org/markup-compatibility/2006" xmlns:aink="http://schemas.microsoft.com/office/drawing/2016/ink" xmlns:am3d="http://schemas.microsoft.com/office/drawing/2017/model3d" xmlns:o="urn:schemas-microsoft-com:office:office" xmlns:oel="http://schemas.microsoft.com/office/2019/extlst" xmlns:r="http://schemas.openxmlformats.org/officeDocument/2006/relationships" xmlns:m="http://schemas.openxmlformats.org/officeDocument/2006/math" xmlns:v="urn:schemas-microsoft-com:vml" xmlns:wp14="http://schemas.microsoft.com/office/word/2010/wordprocessingDrawing" xmlns:wp="http://schemas.openxmlformats.org/drawingml/2006/wordprocessingDrawing" xmlns:w10="urn:schemas-microsoft-com:office:word" xmlns:w="http://schemas.openxmlformats.org/wordprocessingml/2006/main" xmlns:w14="http://schemas.microsoft.com/office/word/2010/wordml" xmlns:w15="http://schemas.microsoft.com/office/word/2012/wordml" xmlns:w16cex="http://schemas.microsoft.com/office/word/2018/wordml/cex" xmlns:w16cid="http://schemas.microsoft.com/office/word/2016/wordml/cid" xmlns:w16="http://schemas.microsoft.com/office/word/2018/wordml" xmlns:w16sdtdh="http://schemas.microsoft.com/office/word/2020/wordml/sdtdatahash" xmlns:w16se="http://schemas.microsoft.com/office/word/2015/wordml/symex" xmlns:wpg="http://schemas.microsoft.com/office/word/2010/wordprocessingGroup" xmlns:wpi="http://schemas.microsoft.com/office/word/2010/wordprocessingInk" xmlns:wne="http://schemas.microsoft.com/office/word/2006/wordml" xmlns:wps="http://schemas.microsoft.com/office/word/2010/wordprocessingShape" mc:Ignorable="w14 w15 w16se w16cid w16 w16cex w16sdtdh wp14">
+<w:endnotes xmlns:wpc="http://schemas.microsoft.com/office/word/2010/wordprocessingCanvas" xmlns:cx="http://schemas.microsoft.com/office/drawing/2014/chartex" xmlns:cx1="http://schemas.microsoft.com/office/drawing/2015/9/8/chartex" xmlns:cx2="http://schemas.microsoft.com/office/drawing/2015/10/21/chartex" xmlns:cx3="http://schemas.microsoft.com/office/drawing/2016/5/9/chartex" xmlns:cx4="http://schemas.microsoft.com/office/drawing/2016/5/10/chartex" xmlns:cx5="http://schemas.microsoft.com/office/drawing/2016/5/11/chartex" xmlns:cx6="http://schemas.microsoft.com/office/drawing/2016/5/12/chartex" xmlns:cx7="http://schemas.microsoft.com/office/drawing/2016/5/13/chartex" xmlns:cx8="http://schemas.microsoft.com/office/drawing/2016/5/14/chartex" xmlns:mc="http://schemas.openxmlformats.org/markup-compatibility/2006" xmlns:aink="http://schemas.microsoft.com/office/drawing/2016/ink" xmlns:am3d="http://schemas.microsoft.com/office/drawing/2017/model3d" xmlns:o="urn:schemas-microsoft-com:office:office" xmlns:oel="http://schemas.microsoft.com/office/2019/extlst" xmlns:r="http://schemas.openxmlformats.org/officeDocument/2006/relationships" xmlns:m="http://schemas.openxmlformats.org/officeDocument/2006/math" xmlns:v="urn:schemas-microsoft-com:vml" xmlns:wp14="http://schemas.microsoft.com/office/word/2010/wordprocessingDrawing" xmlns:wp="http://schemas.openxmlformats.org/drawingml/2006/wordprocessingDrawing" xmlns:w10="urn:schemas-microsoft-com:office:word" xmlns:w="http://schemas.openxmlformats.org/wordprocessingml/2006/main" xmlns:w14="http://schemas.microsoft.com/office/word/2010/wordml" xmlns:w15="http://schemas.microsoft.com/office/word/2012/wordml" xmlns:w16cex="http://schemas.microsoft.com/office/word/2018/wordml/cex" xmlns:w16cid="http://schemas.microsoft.com/office/word/2016/wordml/cid" xmlns:w16="http://schemas.microsoft.com/office/word/2018/wordml" xmlns:w16du="http://schemas.microsoft.com/office/word/2023/wordml/word16du" xmlns:w16sdtdh="http://schemas.microsoft.com/office/word/2020/wordml/sdtdatahash" xmlns:w16sdtfl="http://schemas.microsoft.com/office/word/2024/wordml/sdtformatlock" xmlns:w16se="http://schemas.microsoft.com/office/word/2015/wordml/symex" xmlns:wpg="http://schemas.microsoft.com/office/word/2010/wordprocessingGroup" xmlns:wpi="http://schemas.microsoft.com/office/word/2010/wordprocessingInk" xmlns:wne="http://schemas.microsoft.com/office/word/2006/wordml" xmlns:wps="http://schemas.microsoft.com/office/word/2010/wordprocessingShape" mc:Ignorable="w14 w15 w16se w16cid w16 w16cex w16sdtdh w16sdtfl w16du wp14">
   <w:endnote w:type="separator" w:id="-1">
     <w:p>
       <w:r>
@@ -24585,7 +24550,7 @@
 </file>
 
 <file path=word/footer1.xml><?xml version="1.0" encoding="utf-8"?>
-<w:ftr xmlns:wpc="http://schemas.microsoft.com/office/word/2010/wordprocessingCanvas" xmlns:cx="http://schemas.microsoft.com/office/drawing/2014/chartex" xmlns:cx1="http://schemas.microsoft.com/office/drawing/2015/9/8/chartex" xmlns:cx2="http://schemas.microsoft.com/office/drawing/2015/10/21/chartex" xmlns:cx3="http://schemas.microsoft.com/office/drawing/2016/5/9/chartex" xmlns:cx4="http://schemas.microsoft.com/office/drawing/2016/5/10/chartex" xmlns:cx5="http://schemas.microsoft.com/office/drawing/2016/5/11/chartex" xmlns:cx6="http://schemas.microsoft.com/office/drawing/2016/5/12/chartex" xmlns:cx7="http://schemas.microsoft.com/office/drawing/2016/5/13/chartex" xmlns:cx8="http://schemas.microsoft.com/office/drawing/2016/5/14/chartex" xmlns:mc="http://schemas.openxmlformats.org/markup-compatibility/2006" xmlns:aink="http://schemas.microsoft.com/office/drawing/2016/ink" xmlns:am3d="http://schemas.microsoft.com/office/drawing/2017/model3d" xmlns:o="urn:schemas-microsoft-com:office:office" xmlns:oel="http://schemas.microsoft.com/office/2019/extlst" xmlns:r="http://schemas.openxmlformats.org/officeDocument/2006/relationships" xmlns:m="http://schemas.openxmlformats.org/officeDocument/2006/math" xmlns:v="urn:schemas-microsoft-com:vml" xmlns:wp14="http://schemas.microsoft.com/office/word/2010/wordprocessingDrawing" xmlns:wp="http://schemas.openxmlformats.org/drawingml/2006/wordprocessingDrawing" xmlns:w10="urn:schemas-microsoft-com:office:word" xmlns:w="http://schemas.openxmlformats.org/wordprocessingml/2006/main" xmlns:w14="http://schemas.microsoft.com/office/word/2010/wordml" xmlns:w15="http://schemas.microsoft.com/office/word/2012/wordml" xmlns:w16cex="http://schemas.microsoft.com/office/word/2018/wordml/cex" xmlns:w16cid="http://schemas.microsoft.com/office/word/2016/wordml/cid" xmlns:w16="http://schemas.microsoft.com/office/word/2018/wordml" xmlns:w16sdtdh="http://schemas.microsoft.com/office/word/2020/wordml/sdtdatahash" xmlns:w16se="http://schemas.microsoft.com/office/word/2015/wordml/symex" xmlns:wpg="http://schemas.microsoft.com/office/word/2010/wordprocessingGroup" xmlns:wpi="http://schemas.microsoft.com/office/word/2010/wordprocessingInk" xmlns:wne="http://schemas.microsoft.com/office/word/2006/wordml" xmlns:wps="http://schemas.microsoft.com/office/word/2010/wordprocessingShape" mc:Ignorable="w14 w15 w16se w16cid w16 w16cex w16sdtdh wp14">
+<w:ftr xmlns:wpc="http://schemas.microsoft.com/office/word/2010/wordprocessingCanvas" xmlns:cx="http://schemas.microsoft.com/office/drawing/2014/chartex" xmlns:cx1="http://schemas.microsoft.com/office/drawing/2015/9/8/chartex" xmlns:cx2="http://schemas.microsoft.com/office/drawing/2015/10/21/chartex" xmlns:cx3="http://schemas.microsoft.com/office/drawing/2016/5/9/chartex" xmlns:cx4="http://schemas.microsoft.com/office/drawing/2016/5/10/chartex" xmlns:cx5="http://schemas.microsoft.com/office/drawing/2016/5/11/chartex" xmlns:cx6="http://schemas.microsoft.com/office/drawing/2016/5/12/chartex" xmlns:cx7="http://schemas.microsoft.com/office/drawing/2016/5/13/chartex" xmlns:cx8="http://schemas.microsoft.com/office/drawing/2016/5/14/chartex" xmlns:mc="http://schemas.openxmlformats.org/markup-compatibility/2006" xmlns:aink="http://schemas.microsoft.com/office/drawing/2016/ink" xmlns:am3d="http://schemas.microsoft.com/office/drawing/2017/model3d" xmlns:o="urn:schemas-microsoft-com:office:office" xmlns:oel="http://schemas.microsoft.com/office/2019/extlst" xmlns:r="http://schemas.openxmlformats.org/officeDocument/2006/relationships" xmlns:m="http://schemas.openxmlformats.org/officeDocument/2006/math" xmlns:v="urn:schemas-microsoft-com:vml" xmlns:wp14="http://schemas.microsoft.com/office/word/2010/wordprocessingDrawing" xmlns:wp="http://schemas.openxmlformats.org/drawingml/2006/wordprocessingDrawing" xmlns:w10="urn:schemas-microsoft-com:office:word" xmlns:w="http://schemas.openxmlformats.org/wordprocessingml/2006/main" xmlns:w14="http://schemas.microsoft.com/office/word/2010/wordml" xmlns:w15="http://schemas.microsoft.com/office/word/2012/wordml" xmlns:w16cex="http://schemas.microsoft.com/office/word/2018/wordml/cex" xmlns:w16cid="http://schemas.microsoft.com/office/word/2016/wordml/cid" xmlns:w16="http://schemas.microsoft.com/office/word/2018/wordml" xmlns:w16du="http://schemas.microsoft.com/office/word/2023/wordml/word16du" xmlns:w16sdtdh="http://schemas.microsoft.com/office/word/2020/wordml/sdtdatahash" xmlns:w16sdtfl="http://schemas.microsoft.com/office/word/2024/wordml/sdtformatlock" xmlns:w16se="http://schemas.microsoft.com/office/word/2015/wordml/symex" xmlns:wpg="http://schemas.microsoft.com/office/word/2010/wordprocessingGroup" xmlns:wpi="http://schemas.microsoft.com/office/word/2010/wordprocessingInk" xmlns:wne="http://schemas.microsoft.com/office/word/2006/wordml" xmlns:wps="http://schemas.microsoft.com/office/word/2010/wordprocessingShape" mc:Ignorable="w14 w15 w16se w16cid w16 w16cex w16sdtdh w16sdtfl w16du wp14">
   <w:p>
     <w:pPr>
       <w:pStyle w:val="Fuzeile"/>
@@ -24614,7 +24579,7 @@
 </file>
 
 <file path=word/footnotes.xml><?xml version="1.0" encoding="utf-8"?>
-<w:footnotes xmlns:wpc="http://schemas.microsoft.com/office/word/2010/wordprocessingCanvas" xmlns:cx="http://schemas.microsoft.com/office/drawing/2014/chartex" xmlns:cx1="http://schemas.microsoft.com/office/drawing/2015/9/8/chartex" xmlns:cx2="http://schemas.microsoft.com/office/drawing/2015/10/21/chartex" xmlns:cx3="http://schemas.microsoft.com/office/drawing/2016/5/9/chartex" xmlns:cx4="http://schemas.microsoft.com/office/drawing/2016/5/10/chartex" xmlns:cx5="http://schemas.microsoft.com/office/drawing/2016/5/11/chartex" xmlns:cx6="http://schemas.microsoft.com/office/drawing/2016/5/12/chartex" xmlns:cx7="http://schemas.microsoft.com/office/drawing/2016/5/13/chartex" xmlns:cx8="http://schemas.microsoft.com/office/drawing/2016/5/14/chartex" xmlns:mc="http://schemas.openxmlformats.org/markup-compatibility/2006" xmlns:aink="http://schemas.microsoft.com/office/drawing/2016/ink" xmlns:am3d="http://schemas.microsoft.com/office/drawing/2017/model3d" xmlns:o="urn:schemas-microsoft-com:office:office" xmlns:oel="http://schemas.microsoft.com/office/2019/extlst" xmlns:r="http://schemas.openxmlformats.org/officeDocument/2006/relationships" xmlns:m="http://schemas.openxmlformats.org/officeDocument/2006/math" xmlns:v="urn:schemas-microsoft-com:vml" xmlns:wp14="http://schemas.microsoft.com/office/word/2010/wordprocessingDrawing" xmlns:wp="http://schemas.openxmlformats.org/drawingml/2006/wordprocessingDrawing" xmlns:w10="urn:schemas-microsoft-com:office:word" xmlns:w="http://schemas.openxmlformats.org/wordprocessingml/2006/main" xmlns:w14="http://schemas.microsoft.com/office/word/2010/wordml" xmlns:w15="http://schemas.microsoft.com/office/word/2012/wordml" xmlns:w16cex="http://schemas.microsoft.com/office/word/2018/wordml/cex" xmlns:w16cid="http://schemas.microsoft.com/office/word/2016/wordml/cid" xmlns:w16="http://schemas.microsoft.com/office/word/2018/wordml" xmlns:w16sdtdh="http://schemas.microsoft.com/office/word/2020/wordml/sdtdatahash" xmlns:w16se="http://schemas.microsoft.com/office/word/2015/wordml/symex" xmlns:wpg="http://schemas.microsoft.com/office/word/2010/wordprocessingGroup" xmlns:wpi="http://schemas.microsoft.com/office/word/2010/wordprocessingInk" xmlns:wne="http://schemas.microsoft.com/office/word/2006/wordml" xmlns:wps="http://schemas.microsoft.com/office/word/2010/wordprocessingShape" mc:Ignorable="w14 w15 w16se w16cid w16 w16cex w16sdtdh wp14">
+<w:footnotes xmlns:wpc="http://schemas.microsoft.com/office/word/2010/wordprocessingCanvas" xmlns:cx="http://schemas.microsoft.com/office/drawing/2014/chartex" xmlns:cx1="http://schemas.microsoft.com/office/drawing/2015/9/8/chartex" xmlns:cx2="http://schemas.microsoft.com/office/drawing/2015/10/21/chartex" xmlns:cx3="http://schemas.microsoft.com/office/drawing/2016/5/9/chartex" xmlns:cx4="http://schemas.microsoft.com/office/drawing/2016/5/10/chartex" xmlns:cx5="http://schemas.microsoft.com/office/drawing/2016/5/11/chartex" xmlns:cx6="http://schemas.microsoft.com/office/drawing/2016/5/12/chartex" xmlns:cx7="http://schemas.microsoft.com/office/drawing/2016/5/13/chartex" xmlns:cx8="http://schemas.microsoft.com/office/drawing/2016/5/14/chartex" xmlns:mc="http://schemas.openxmlformats.org/markup-compatibility/2006" xmlns:aink="http://schemas.microsoft.com/office/drawing/2016/ink" xmlns:am3d="http://schemas.microsoft.com/office/drawing/2017/model3d" xmlns:o="urn:schemas-microsoft-com:office:office" xmlns:oel="http://schemas.microsoft.com/office/2019/extlst" xmlns:r="http://schemas.openxmlformats.org/officeDocument/2006/relationships" xmlns:m="http://schemas.openxmlformats.org/officeDocument/2006/math" xmlns:v="urn:schemas-microsoft-com:vml" xmlns:wp14="http://schemas.microsoft.com/office/word/2010/wordprocessingDrawing" xmlns:wp="http://schemas.openxmlformats.org/drawingml/2006/wordprocessingDrawing" xmlns:w10="urn:schemas-microsoft-com:office:word" xmlns:w="http://schemas.openxmlformats.org/wordprocessingml/2006/main" xmlns:w14="http://schemas.microsoft.com/office/word/2010/wordml" xmlns:w15="http://schemas.microsoft.com/office/word/2012/wordml" xmlns:w16cex="http://schemas.microsoft.com/office/word/2018/wordml/cex" xmlns:w16cid="http://schemas.microsoft.com/office/word/2016/wordml/cid" xmlns:w16="http://schemas.microsoft.com/office/word/2018/wordml" xmlns:w16du="http://schemas.microsoft.com/office/word/2023/wordml/word16du" xmlns:w16sdtdh="http://schemas.microsoft.com/office/word/2020/wordml/sdtdatahash" xmlns:w16sdtfl="http://schemas.microsoft.com/office/word/2024/wordml/sdtformatlock" xmlns:w16se="http://schemas.microsoft.com/office/word/2015/wordml/symex" xmlns:wpg="http://schemas.microsoft.com/office/word/2010/wordprocessingGroup" xmlns:wpi="http://schemas.microsoft.com/office/word/2010/wordprocessingInk" xmlns:wne="http://schemas.microsoft.com/office/word/2006/wordml" xmlns:wps="http://schemas.microsoft.com/office/word/2010/wordprocessingShape" mc:Ignorable="w14 w15 w16se w16cid w16 w16cex w16sdtdh w16sdtfl w16du wp14">
   <w:footnote w:type="separator" w:id="-1">
     <w:p>
       <w:r>
@@ -24633,7 +24598,7 @@
 </file>
 
 <file path=word/header1.xml><?xml version="1.0" encoding="utf-8"?>
-<w:hdr xmlns:wpc="http://schemas.microsoft.com/office/word/2010/wordprocessingCanvas" xmlns:cx="http://schemas.microsoft.com/office/drawing/2014/chartex" xmlns:cx1="http://schemas.microsoft.com/office/drawing/2015/9/8/chartex" xmlns:cx2="http://schemas.microsoft.com/office/drawing/2015/10/21/chartex" xmlns:cx3="http://schemas.microsoft.com/office/drawing/2016/5/9/chartex" xmlns:cx4="http://schemas.microsoft.com/office/drawing/2016/5/10/chartex" xmlns:cx5="http://schemas.microsoft.com/office/drawing/2016/5/11/chartex" xmlns:cx6="http://schemas.microsoft.com/office/drawing/2016/5/12/chartex" xmlns:cx7="http://schemas.microsoft.com/office/drawing/2016/5/13/chartex" xmlns:cx8="http://schemas.microsoft.com/office/drawing/2016/5/14/chartex" xmlns:mc="http://schemas.openxmlformats.org/markup-compatibility/2006" xmlns:aink="http://schemas.microsoft.com/office/drawing/2016/ink" xmlns:am3d="http://schemas.microsoft.com/office/drawing/2017/model3d" xmlns:o="urn:schemas-microsoft-com:office:office" xmlns:oel="http://schemas.microsoft.com/office/2019/extlst" xmlns:r="http://schemas.openxmlformats.org/officeDocument/2006/relationships" xmlns:m="http://schemas.openxmlformats.org/officeDocument/2006/math" xmlns:v="urn:schemas-microsoft-com:vml" xmlns:wp14="http://schemas.microsoft.com/office/word/2010/wordprocessingDrawing" xmlns:wp="http://schemas.openxmlformats.org/drawingml/2006/wordprocessingDrawing" xmlns:w10="urn:schemas-microsoft-com:office:word" xmlns:w="http://schemas.openxmlformats.org/wordprocessingml/2006/main" xmlns:w14="http://schemas.microsoft.com/office/word/2010/wordml" xmlns:w15="http://schemas.microsoft.com/office/word/2012/wordml" xmlns:w16cex="http://schemas.microsoft.com/office/word/2018/wordml/cex" xmlns:w16cid="http://schemas.microsoft.com/office/word/2016/wordml/cid" xmlns:w16="http://schemas.microsoft.com/office/word/2018/wordml" xmlns:w16sdtdh="http://schemas.microsoft.com/office/word/2020/wordml/sdtdatahash" xmlns:w16se="http://schemas.microsoft.com/office/word/2015/wordml/symex" xmlns:wpg="http://schemas.microsoft.com/office/word/2010/wordprocessingGroup" xmlns:wpi="http://schemas.microsoft.com/office/word/2010/wordprocessingInk" xmlns:wne="http://schemas.microsoft.com/office/word/2006/wordml" xmlns:wps="http://schemas.microsoft.com/office/word/2010/wordprocessingShape" mc:Ignorable="w14 w15 w16se w16cid w16 w16cex w16sdtdh wp14">
+<w:hdr xmlns:wpc="http://schemas.microsoft.com/office/word/2010/wordprocessingCanvas" xmlns:cx="http://schemas.microsoft.com/office/drawing/2014/chartex" xmlns:cx1="http://schemas.microsoft.com/office/drawing/2015/9/8/chartex" xmlns:cx2="http://schemas.microsoft.com/office/drawing/2015/10/21/chartex" xmlns:cx3="http://schemas.microsoft.com/office/drawing/2016/5/9/chartex" xmlns:cx4="http://schemas.microsoft.com/office/drawing/2016/5/10/chartex" xmlns:cx5="http://schemas.microsoft.com/office/drawing/2016/5/11/chartex" xmlns:cx6="http://schemas.microsoft.com/office/drawing/2016/5/12/chartex" xmlns:cx7="http://schemas.microsoft.com/office/drawing/2016/5/13/chartex" xmlns:cx8="http://schemas.microsoft.com/office/drawing/2016/5/14/chartex" xmlns:mc="http://schemas.openxmlformats.org/markup-compatibility/2006" xmlns:aink="http://schemas.microsoft.com/office/drawing/2016/ink" xmlns:am3d="http://schemas.microsoft.com/office/drawing/2017/model3d" xmlns:o="urn:schemas-microsoft-com:office:office" xmlns:oel="http://schemas.microsoft.com/office/2019/extlst" xmlns:r="http://schemas.openxmlformats.org/officeDocument/2006/relationships" xmlns:m="http://schemas.openxmlformats.org/officeDocument/2006/math" xmlns:v="urn:schemas-microsoft-com:vml" xmlns:wp14="http://schemas.microsoft.com/office/word/2010/wordprocessingDrawing" xmlns:wp="http://schemas.openxmlformats.org/drawingml/2006/wordprocessingDrawing" xmlns:w10="urn:schemas-microsoft-com:office:word" xmlns:w="http://schemas.openxmlformats.org/wordprocessingml/2006/main" xmlns:w14="http://schemas.microsoft.com/office/word/2010/wordml" xmlns:w15="http://schemas.microsoft.com/office/word/2012/wordml" xmlns:w16cex="http://schemas.microsoft.com/office/word/2018/wordml/cex" xmlns:w16cid="http://schemas.microsoft.com/office/word/2016/wordml/cid" xmlns:w16="http://schemas.microsoft.com/office/word/2018/wordml" xmlns:w16du="http://schemas.microsoft.com/office/word/2023/wordml/word16du" xmlns:w16sdtdh="http://schemas.microsoft.com/office/word/2020/wordml/sdtdatahash" xmlns:w16sdtfl="http://schemas.microsoft.com/office/word/2024/wordml/sdtformatlock" xmlns:w16se="http://schemas.microsoft.com/office/word/2015/wordml/symex" xmlns:wpg="http://schemas.microsoft.com/office/word/2010/wordprocessingGroup" xmlns:wpi="http://schemas.microsoft.com/office/word/2010/wordprocessingInk" xmlns:wne="http://schemas.microsoft.com/office/word/2006/wordml" xmlns:wps="http://schemas.microsoft.com/office/word/2010/wordprocessingShape" mc:Ignorable="w14 w15 w16se w16cid w16 w16cex w16sdtdh w16sdtfl w16du wp14">
   <w:p>
     <w:pPr>
       <w:pStyle w:val="Kopf-undFuzeilen"/>
@@ -24643,7 +24608,7 @@
 </file>
 
 <file path=word/numbering.xml><?xml version="1.0" encoding="utf-8"?>
-<w:numbering xmlns:wpc="http://schemas.microsoft.com/office/word/2010/wordprocessingCanvas" xmlns:cx="http://schemas.microsoft.com/office/drawing/2014/chartex" xmlns:cx1="http://schemas.microsoft.com/office/drawing/2015/9/8/chartex" xmlns:cx2="http://schemas.microsoft.com/office/drawing/2015/10/21/chartex" xmlns:cx3="http://schemas.microsoft.com/office/drawing/2016/5/9/chartex" xmlns:cx4="http://schemas.microsoft.com/office/drawing/2016/5/10/chartex" xmlns:cx5="http://schemas.microsoft.com/office/drawing/2016/5/11/chartex" xmlns:cx6="http://schemas.microsoft.com/office/drawing/2016/5/12/chartex" xmlns:cx7="http://schemas.microsoft.com/office/drawing/2016/5/13/chartex" xmlns:cx8="http://schemas.microsoft.com/office/drawing/2016/5/14/chartex" xmlns:mc="http://schemas.openxmlformats.org/markup-compatibility/2006" xmlns:aink="http://schemas.microsoft.com/office/drawing/2016/ink" xmlns:am3d="http://schemas.microsoft.com/office/drawing/2017/model3d" xmlns:o="urn:schemas-microsoft-com:office:office" xmlns:oel="http://schemas.microsoft.com/office/2019/extlst" xmlns:r="http://schemas.openxmlformats.org/officeDocument/2006/relationships" xmlns:m="http://schemas.openxmlformats.org/officeDocument/2006/math" xmlns:v="urn:schemas-microsoft-com:vml" xmlns:wp14="http://schemas.microsoft.com/office/word/2010/wordprocessingDrawing" xmlns:wp="http://schemas.openxmlformats.org/drawingml/2006/wordprocessingDrawing" xmlns:w10="urn:schemas-microsoft-com:office:word" xmlns:w="http://schemas.openxmlformats.org/wordprocessingml/2006/main" xmlns:w14="http://schemas.microsoft.com/office/word/2010/wordml" xmlns:w15="http://schemas.microsoft.com/office/word/2012/wordml" xmlns:w16cex="http://schemas.microsoft.com/office/word/2018/wordml/cex" xmlns:w16cid="http://schemas.microsoft.com/office/word/2016/wordml/cid" xmlns:w16="http://schemas.microsoft.com/office/word/2018/wordml" xmlns:w16sdtdh="http://schemas.microsoft.com/office/word/2020/wordml/sdtdatahash" xmlns:w16se="http://schemas.microsoft.com/office/word/2015/wordml/symex" xmlns:wpg="http://schemas.microsoft.com/office/word/2010/wordprocessingGroup" xmlns:wpi="http://schemas.microsoft.com/office/word/2010/wordprocessingInk" xmlns:wne="http://schemas.microsoft.com/office/word/2006/wordml" xmlns:wps="http://schemas.microsoft.com/office/word/2010/wordprocessingShape" mc:Ignorable="w14 w15 w16se w16cid w16 w16cex w16sdtdh wp14">
+<w:numbering xmlns:wpc="http://schemas.microsoft.com/office/word/2010/wordprocessingCanvas" xmlns:cx="http://schemas.microsoft.com/office/drawing/2014/chartex" xmlns:cx1="http://schemas.microsoft.com/office/drawing/2015/9/8/chartex" xmlns:cx2="http://schemas.microsoft.com/office/drawing/2015/10/21/chartex" xmlns:cx3="http://schemas.microsoft.com/office/drawing/2016/5/9/chartex" xmlns:cx4="http://schemas.microsoft.com/office/drawing/2016/5/10/chartex" xmlns:cx5="http://schemas.microsoft.com/office/drawing/2016/5/11/chartex" xmlns:cx6="http://schemas.microsoft.com/office/drawing/2016/5/12/chartex" xmlns:cx7="http://schemas.microsoft.com/office/drawing/2016/5/13/chartex" xmlns:cx8="http://schemas.microsoft.com/office/drawing/2016/5/14/chartex" xmlns:mc="http://schemas.openxmlformats.org/markup-compatibility/2006" xmlns:aink="http://schemas.microsoft.com/office/drawing/2016/ink" xmlns:am3d="http://schemas.microsoft.com/office/drawing/2017/model3d" xmlns:o="urn:schemas-microsoft-com:office:office" xmlns:oel="http://schemas.microsoft.com/office/2019/extlst" xmlns:r="http://schemas.openxmlformats.org/officeDocument/2006/relationships" xmlns:m="http://schemas.openxmlformats.org/officeDocument/2006/math" xmlns:v="urn:schemas-microsoft-com:vml" xmlns:wp14="http://schemas.microsoft.com/office/word/2010/wordprocessingDrawing" xmlns:wp="http://schemas.openxmlformats.org/drawingml/2006/wordprocessingDrawing" xmlns:w10="urn:schemas-microsoft-com:office:word" xmlns:w="http://schemas.openxmlformats.org/wordprocessingml/2006/main" xmlns:w14="http://schemas.microsoft.com/office/word/2010/wordml" xmlns:w15="http://schemas.microsoft.com/office/word/2012/wordml" xmlns:w16cex="http://schemas.microsoft.com/office/word/2018/wordml/cex" xmlns:w16cid="http://schemas.microsoft.com/office/word/2016/wordml/cid" xmlns:w16="http://schemas.microsoft.com/office/word/2018/wordml" xmlns:w16du="http://schemas.microsoft.com/office/word/2023/wordml/word16du" xmlns:w16sdtdh="http://schemas.microsoft.com/office/word/2020/wordml/sdtdatahash" xmlns:w16sdtfl="http://schemas.microsoft.com/office/word/2024/wordml/sdtformatlock" xmlns:w16se="http://schemas.microsoft.com/office/word/2015/wordml/symex" xmlns:wpg="http://schemas.microsoft.com/office/word/2010/wordprocessingGroup" xmlns:wpi="http://schemas.microsoft.com/office/word/2010/wordprocessingInk" xmlns:wne="http://schemas.microsoft.com/office/word/2006/wordml" xmlns:wps="http://schemas.microsoft.com/office/word/2010/wordprocessingShape" mc:Ignorable="w14 w15 w16se w16cid w16 w16cex w16sdtdh w16sdtfl w16du wp14">
   <w:abstractNum w:abstractNumId="0" w15:restartNumberingAfterBreak="0">
     <w:nsid w:val="0AB85332"/>
     <w:multiLevelType w:val="hybridMultilevel"/>
@@ -27160,7 +27125,7 @@
   <w:num w:numId="3" w16cid:durableId="198133242">
     <w:abstractNumId w:val="16"/>
     <w:lvlOverride w:ilvl="0">
-      <w:lvl w:ilvl="0" w:tplc="5C326D48">
+      <w:lvl w:ilvl="0" w:tplc="E334ED1A">
         <w:start w:val="1"/>
         <w:numFmt w:val="bullet"/>
         <w:lvlText w:val="·"/>
@@ -27191,7 +27156,7 @@
       </w:lvl>
     </w:lvlOverride>
     <w:lvlOverride w:ilvl="1">
-      <w:lvl w:ilvl="1" w:tplc="005E5096">
+      <w:lvl w:ilvl="1" w:tplc="BAAA7F4E">
         <w:start w:val="1"/>
         <w:numFmt w:val="bullet"/>
         <w:lvlText w:val="o"/>
@@ -27222,7 +27187,7 @@
       </w:lvl>
     </w:lvlOverride>
     <w:lvlOverride w:ilvl="2">
-      <w:lvl w:ilvl="2" w:tplc="ED0439F6">
+      <w:lvl w:ilvl="2" w:tplc="5B7658CE">
         <w:start w:val="1"/>
         <w:numFmt w:val="bullet"/>
         <w:lvlText w:val="▪"/>
@@ -27253,7 +27218,7 @@
       </w:lvl>
     </w:lvlOverride>
     <w:lvlOverride w:ilvl="3">
-      <w:lvl w:ilvl="3" w:tplc="E1A883DC">
+      <w:lvl w:ilvl="3" w:tplc="6C6AB7D6">
         <w:start w:val="1"/>
         <w:numFmt w:val="bullet"/>
         <w:lvlText w:val="·"/>
@@ -27284,7 +27249,7 @@
       </w:lvl>
     </w:lvlOverride>
     <w:lvlOverride w:ilvl="4">
-      <w:lvl w:ilvl="4" w:tplc="128CDAB0">
+      <w:lvl w:ilvl="4" w:tplc="055A96FC">
         <w:start w:val="1"/>
         <w:numFmt w:val="bullet"/>
         <w:lvlText w:val="o"/>
@@ -27315,7 +27280,7 @@
       </w:lvl>
     </w:lvlOverride>
     <w:lvlOverride w:ilvl="5">
-      <w:lvl w:ilvl="5" w:tplc="55C6FF0E">
+      <w:lvl w:ilvl="5" w:tplc="E3A86B04">
         <w:start w:val="1"/>
         <w:numFmt w:val="bullet"/>
         <w:lvlText w:val="▪"/>
@@ -27346,7 +27311,7 @@
       </w:lvl>
     </w:lvlOverride>
     <w:lvlOverride w:ilvl="6">
-      <w:lvl w:ilvl="6" w:tplc="3F5AAD30">
+      <w:lvl w:ilvl="6" w:tplc="F6246FA6">
         <w:start w:val="1"/>
         <w:numFmt w:val="bullet"/>
         <w:lvlText w:val="·"/>
@@ -27377,7 +27342,7 @@
       </w:lvl>
     </w:lvlOverride>
     <w:lvlOverride w:ilvl="7">
-      <w:lvl w:ilvl="7" w:tplc="A4B894E2">
+      <w:lvl w:ilvl="7" w:tplc="AEA8E102">
         <w:start w:val="1"/>
         <w:numFmt w:val="bullet"/>
         <w:lvlText w:val="o"/>
@@ -27408,7 +27373,7 @@
       </w:lvl>
     </w:lvlOverride>
     <w:lvlOverride w:ilvl="8">
-      <w:lvl w:ilvl="8" w:tplc="4E76672A">
+      <w:lvl w:ilvl="8" w:tplc="C7E060C2">
         <w:start w:val="1"/>
         <w:numFmt w:val="bullet"/>
         <w:lvlText w:val="▪"/>
@@ -27503,7 +27468,7 @@
 </file>
 
 <file path=word/styles.xml><?xml version="1.0" encoding="utf-8"?>
-<w:styles xmlns:mc="http://schemas.openxmlformats.org/markup-compatibility/2006" xmlns:r="http://schemas.openxmlformats.org/officeDocument/2006/relationships" xmlns:w="http://schemas.openxmlformats.org/wordprocessingml/2006/main" xmlns:w14="http://schemas.microsoft.com/office/word/2010/wordml" xmlns:w15="http://schemas.microsoft.com/office/word/2012/wordml" xmlns:w16cex="http://schemas.microsoft.com/office/word/2018/wordml/cex" xmlns:w16cid="http://schemas.microsoft.com/office/word/2016/wordml/cid" xmlns:w16="http://schemas.microsoft.com/office/word/2018/wordml" xmlns:w16sdtdh="http://schemas.microsoft.com/office/word/2020/wordml/sdtdatahash" xmlns:w16se="http://schemas.microsoft.com/office/word/2015/wordml/symex" mc:Ignorable="w14 w15 w16se w16cid w16 w16cex w16sdtdh">
+<w:styles xmlns:mc="http://schemas.openxmlformats.org/markup-compatibility/2006" xmlns:r="http://schemas.openxmlformats.org/officeDocument/2006/relationships" xmlns:w="http://schemas.openxmlformats.org/wordprocessingml/2006/main" xmlns:w14="http://schemas.microsoft.com/office/word/2010/wordml" xmlns:w15="http://schemas.microsoft.com/office/word/2012/wordml" xmlns:w16cex="http://schemas.microsoft.com/office/word/2018/wordml/cex" xmlns:w16cid="http://schemas.microsoft.com/office/word/2016/wordml/cid" xmlns:w16="http://schemas.microsoft.com/office/word/2018/wordml" xmlns:w16du="http://schemas.microsoft.com/office/word/2023/wordml/word16du" xmlns:w16sdtdh="http://schemas.microsoft.com/office/word/2020/wordml/sdtdatahash" xmlns:w16sdtfl="http://schemas.microsoft.com/office/word/2024/wordml/sdtformatlock" xmlns:w16se="http://schemas.microsoft.com/office/word/2015/wordml/symex" mc:Ignorable="w14 w15 w16se w16cid w16 w16cex w16sdtdh w16sdtfl w16du">
   <w:docDefaults>
     <w:rPrDefault>
       <w:rPr>

</xml_diff>